<commit_message>
Update UHasselt Software Center.docx
</commit_message>
<xml_diff>
--- a/assets/UHasselt Software Center.docx
+++ b/assets/UHasselt Software Center.docx
@@ -16,8 +16,18 @@
           <w:b/>
           <w:bCs/>
         </w:rPr>
-        <w:t>Open Software Center</w:t>
-      </w:r>
+        <w:t xml:space="preserve">Open Software </w:t>
+      </w:r>
+      <w:proofErr w:type="spellStart"/>
+      <w:r>
+        <w:rPr>
+          <w:rFonts w:ascii="Calibri" w:hAnsi="Calibri" w:cs="Calibri"/>
+          <w:b/>
+          <w:bCs/>
+        </w:rPr>
+        <w:t>Center</w:t>
+      </w:r>
+      <w:proofErr w:type="spellEnd"/>
     </w:p>
     <w:p>
       <w:pPr>
@@ -33,7 +43,35 @@
         <w:rPr>
           <w:rFonts w:ascii="Calibri" w:hAnsi="Calibri" w:cs="Calibri"/>
         </w:rPr>
-        <w:t>The desktop of your UHasselt laptop normally has a shortcut to Software Center.</w:t>
+        <w:t xml:space="preserve">The desktop of your </w:t>
+      </w:r>
+      <w:proofErr w:type="spellStart"/>
+      <w:r>
+        <w:rPr>
+          <w:rFonts w:ascii="Calibri" w:hAnsi="Calibri" w:cs="Calibri"/>
+        </w:rPr>
+        <w:t>UHasselt</w:t>
+      </w:r>
+      <w:proofErr w:type="spellEnd"/>
+      <w:r>
+        <w:rPr>
+          <w:rFonts w:ascii="Calibri" w:hAnsi="Calibri" w:cs="Calibri"/>
+        </w:rPr>
+        <w:t xml:space="preserve"> laptop normally has a shortcut to Software </w:t>
+      </w:r>
+      <w:proofErr w:type="spellStart"/>
+      <w:r>
+        <w:rPr>
+          <w:rFonts w:ascii="Calibri" w:hAnsi="Calibri" w:cs="Calibri"/>
+        </w:rPr>
+        <w:t>Center</w:t>
+      </w:r>
+      <w:proofErr w:type="spellEnd"/>
+      <w:r>
+        <w:rPr>
+          <w:rFonts w:ascii="Calibri" w:hAnsi="Calibri" w:cs="Calibri"/>
+        </w:rPr>
+        <w:t>.</w:t>
       </w:r>
     </w:p>
     <w:p>
@@ -58,7 +96,25 @@
           <w:b/>
           <w:bCs/>
         </w:rPr>
-        <w:t>Software Center.</w:t>
+        <w:t xml:space="preserve">Software </w:t>
+      </w:r>
+      <w:proofErr w:type="spellStart"/>
+      <w:r>
+        <w:rPr>
+          <w:rFonts w:ascii="Calibri" w:hAnsi="Calibri" w:cs="Calibri"/>
+          <w:b/>
+          <w:bCs/>
+        </w:rPr>
+        <w:t>Center</w:t>
+      </w:r>
+      <w:proofErr w:type="spellEnd"/>
+      <w:r>
+        <w:rPr>
+          <w:rFonts w:ascii="Calibri" w:hAnsi="Calibri" w:cs="Calibri"/>
+          <w:b/>
+          <w:bCs/>
+        </w:rPr>
+        <w:t>.</w:t>
       </w:r>
     </w:p>
     <w:p>
@@ -75,7 +131,127 @@
         <w:rPr>
           <w:rFonts w:ascii="Calibri" w:hAnsi="Calibri" w:cs="Calibri"/>
         </w:rPr>
-        <w:t>Posix and Posit are the same thing, it's just a typo</w:t>
+        <w:t xml:space="preserve">Explore </w:t>
+      </w:r>
+      <w:r>
+        <w:rPr>
+          <w:rFonts w:ascii="Calibri" w:hAnsi="Calibri" w:cs="Calibri"/>
+          <w:b/>
+          <w:bCs/>
+        </w:rPr>
+        <w:t>CRAN R</w:t>
+      </w:r>
+      <w:r>
+        <w:rPr>
+          <w:rFonts w:ascii="Calibri" w:hAnsi="Calibri" w:cs="Calibri"/>
+        </w:rPr>
+        <w:t xml:space="preserve"> and </w:t>
+      </w:r>
+      <w:r>
+        <w:rPr>
+          <w:rFonts w:ascii="Calibri" w:hAnsi="Calibri" w:cs="Calibri"/>
+          <w:b/>
+          <w:bCs/>
+        </w:rPr>
+        <w:t>RStudio</w:t>
+      </w:r>
+      <w:r>
+        <w:rPr>
+          <w:rFonts w:ascii="Calibri" w:hAnsi="Calibri" w:cs="Calibri"/>
+          <w:b/>
+          <w:bCs/>
+        </w:rPr>
+        <w:t xml:space="preserve">, </w:t>
+      </w:r>
+      <w:r>
+        <w:rPr>
+          <w:rFonts w:ascii="Calibri" w:hAnsi="Calibri" w:cs="Calibri"/>
+        </w:rPr>
+        <w:t>separately</w:t>
+      </w:r>
+      <w:r>
+        <w:rPr>
+          <w:rFonts w:ascii="Calibri" w:hAnsi="Calibri" w:cs="Calibri"/>
+        </w:rPr>
+        <w:t xml:space="preserve">. You may find </w:t>
+      </w:r>
+      <w:r>
+        <w:rPr>
+          <w:rFonts w:ascii="Calibri" w:hAnsi="Calibri" w:cs="Calibri"/>
+          <w:b/>
+          <w:bCs/>
+        </w:rPr>
+        <w:t xml:space="preserve">RStudio </w:t>
+      </w:r>
+      <w:proofErr w:type="spellStart"/>
+      <w:r>
+        <w:rPr>
+          <w:rFonts w:ascii="Calibri" w:hAnsi="Calibri" w:cs="Calibri"/>
+          <w:b/>
+          <w:bCs/>
+        </w:rPr>
+        <w:t>Posix</w:t>
+      </w:r>
+      <w:proofErr w:type="spellEnd"/>
+      <w:r>
+        <w:rPr>
+          <w:rFonts w:ascii="Calibri" w:hAnsi="Calibri" w:cs="Calibri"/>
+        </w:rPr>
+        <w:t xml:space="preserve"> </w:t>
+      </w:r>
+      <w:r>
+        <w:rPr>
+          <w:rFonts w:ascii="Calibri" w:hAnsi="Calibri" w:cs="Calibri"/>
+        </w:rPr>
+        <w:t xml:space="preserve">at the listed </w:t>
+      </w:r>
+      <w:proofErr w:type="spellStart"/>
+      <w:r>
+        <w:rPr>
+          <w:rFonts w:ascii="Calibri" w:hAnsi="Calibri" w:cs="Calibri"/>
+        </w:rPr>
+        <w:t>softwares</w:t>
+      </w:r>
+      <w:proofErr w:type="spellEnd"/>
+      <w:r>
+        <w:rPr>
+          <w:rFonts w:ascii="Calibri" w:hAnsi="Calibri" w:cs="Calibri"/>
+        </w:rPr>
+        <w:t xml:space="preserve"> </w:t>
+      </w:r>
+      <w:r>
+        <w:rPr>
+          <w:rFonts w:ascii="Calibri" w:hAnsi="Calibri" w:cs="Calibri"/>
+        </w:rPr>
+        <w:t xml:space="preserve">when typing RStudio, </w:t>
+      </w:r>
+      <w:r>
+        <w:rPr>
+          <w:rFonts w:ascii="Calibri" w:hAnsi="Calibri" w:cs="Calibri"/>
+        </w:rPr>
+        <w:t xml:space="preserve">It’s actually the same as </w:t>
+      </w:r>
+      <w:r>
+        <w:rPr>
+          <w:rFonts w:ascii="Calibri" w:hAnsi="Calibri" w:cs="Calibri"/>
+          <w:b/>
+          <w:bCs/>
+        </w:rPr>
+        <w:t xml:space="preserve">RStudio </w:t>
+      </w:r>
+      <w:r>
+        <w:rPr>
+          <w:rFonts w:ascii="Calibri" w:hAnsi="Calibri" w:cs="Calibri"/>
+          <w:b/>
+          <w:bCs/>
+        </w:rPr>
+        <w:t>Posit</w:t>
+      </w:r>
+      <w:r>
+        <w:rPr>
+          <w:rFonts w:ascii="Calibri" w:hAnsi="Calibri" w:cs="Calibri"/>
+        </w:rPr>
+        <w:t>, it's just a typo</w:t>
       </w:r>
       <w:r>
         <w:rPr>
@@ -103,7 +279,25 @@
           <w:b/>
           <w:bCs/>
         </w:rPr>
-        <w:t>Check connection to the UHasselt network</w:t>
+        <w:t xml:space="preserve">Check connection to the </w:t>
+      </w:r>
+      <w:proofErr w:type="spellStart"/>
+      <w:r>
+        <w:rPr>
+          <w:rFonts w:ascii="Calibri" w:hAnsi="Calibri" w:cs="Calibri"/>
+          <w:b/>
+          <w:bCs/>
+        </w:rPr>
+        <w:t>UHasselt</w:t>
+      </w:r>
+      <w:proofErr w:type="spellEnd"/>
+      <w:r>
+        <w:rPr>
+          <w:rFonts w:ascii="Calibri" w:hAnsi="Calibri" w:cs="Calibri"/>
+          <w:b/>
+          <w:bCs/>
+        </w:rPr>
+        <w:t xml:space="preserve"> network</w:t>
       </w:r>
     </w:p>
     <w:p>
@@ -120,7 +314,35 @@
         <w:rPr>
           <w:rFonts w:ascii="Calibri" w:hAnsi="Calibri" w:cs="Calibri"/>
         </w:rPr>
-        <w:t>To install applications via Software Center, you must be connected to the UHasselt network.</w:t>
+        <w:t xml:space="preserve">To install applications via Software </w:t>
+      </w:r>
+      <w:proofErr w:type="spellStart"/>
+      <w:r>
+        <w:rPr>
+          <w:rFonts w:ascii="Calibri" w:hAnsi="Calibri" w:cs="Calibri"/>
+        </w:rPr>
+        <w:t>Center</w:t>
+      </w:r>
+      <w:proofErr w:type="spellEnd"/>
+      <w:r>
+        <w:rPr>
+          <w:rFonts w:ascii="Calibri" w:hAnsi="Calibri" w:cs="Calibri"/>
+        </w:rPr>
+        <w:t xml:space="preserve">, you must be connected to the </w:t>
+      </w:r>
+      <w:proofErr w:type="spellStart"/>
+      <w:r>
+        <w:rPr>
+          <w:rFonts w:ascii="Calibri" w:hAnsi="Calibri" w:cs="Calibri"/>
+        </w:rPr>
+        <w:t>UHasselt</w:t>
+      </w:r>
+      <w:proofErr w:type="spellEnd"/>
+      <w:r>
+        <w:rPr>
+          <w:rFonts w:ascii="Calibri" w:hAnsi="Calibri" w:cs="Calibri"/>
+        </w:rPr>
+        <w:t xml:space="preserve"> network.</w:t>
       </w:r>
     </w:p>
     <w:p>
@@ -137,7 +359,21 @@
         <w:rPr>
           <w:rFonts w:ascii="Calibri" w:hAnsi="Calibri" w:cs="Calibri"/>
         </w:rPr>
-        <w:t>If you work off campus, connect via eduVPN.</w:t>
+        <w:t xml:space="preserve">If you work off campus, connect via </w:t>
+      </w:r>
+      <w:proofErr w:type="spellStart"/>
+      <w:r>
+        <w:rPr>
+          <w:rFonts w:ascii="Calibri" w:hAnsi="Calibri" w:cs="Calibri"/>
+        </w:rPr>
+        <w:t>eduVPN</w:t>
+      </w:r>
+      <w:proofErr w:type="spellEnd"/>
+      <w:r>
+        <w:rPr>
+          <w:rFonts w:ascii="Calibri" w:hAnsi="Calibri" w:cs="Calibri"/>
+        </w:rPr>
+        <w:t>.</w:t>
       </w:r>
     </w:p>
     <w:p>
@@ -206,8 +442,18 @@
           <w:b/>
           <w:bCs/>
         </w:rPr>
-        <w:t>Synchronizing Software Center</w:t>
-      </w:r>
+        <w:t xml:space="preserve">Synchronizing Software </w:t>
+      </w:r>
+      <w:proofErr w:type="spellStart"/>
+      <w:r>
+        <w:rPr>
+          <w:rFonts w:ascii="Calibri" w:hAnsi="Calibri" w:cs="Calibri"/>
+          <w:b/>
+          <w:bCs/>
+        </w:rPr>
+        <w:t>Center</w:t>
+      </w:r>
+      <w:proofErr w:type="spellEnd"/>
     </w:p>
     <w:p>
       <w:pPr>
@@ -219,7 +465,35 @@
         <w:rPr>
           <w:rFonts w:ascii="Calibri" w:hAnsi="Calibri" w:cs="Calibri"/>
         </w:rPr>
-        <w:t>Are you connected to the UHasselt network but still not seeing the applications you want? Then force Software Center to sync:</w:t>
+        <w:t xml:space="preserve">Are you connected to the </w:t>
+      </w:r>
+      <w:proofErr w:type="spellStart"/>
+      <w:r>
+        <w:rPr>
+          <w:rFonts w:ascii="Calibri" w:hAnsi="Calibri" w:cs="Calibri"/>
+        </w:rPr>
+        <w:t>UHasselt</w:t>
+      </w:r>
+      <w:proofErr w:type="spellEnd"/>
+      <w:r>
+        <w:rPr>
+          <w:rFonts w:ascii="Calibri" w:hAnsi="Calibri" w:cs="Calibri"/>
+        </w:rPr>
+        <w:t xml:space="preserve"> network but still not seeing the applications you want? Then force Software </w:t>
+      </w:r>
+      <w:proofErr w:type="spellStart"/>
+      <w:r>
+        <w:rPr>
+          <w:rFonts w:ascii="Calibri" w:hAnsi="Calibri" w:cs="Calibri"/>
+        </w:rPr>
+        <w:t>Center</w:t>
+      </w:r>
+      <w:proofErr w:type="spellEnd"/>
+      <w:r>
+        <w:rPr>
+          <w:rFonts w:ascii="Calibri" w:hAnsi="Calibri" w:cs="Calibri"/>
+        </w:rPr>
+        <w:t xml:space="preserve"> to sync:</w:t>
       </w:r>
     </w:p>
     <w:p>
@@ -238,13 +512,23 @@
         </w:rPr>
         <w:t xml:space="preserve">Open </w:t>
       </w:r>
-      <w:r>
-        <w:rPr>
-          <w:rFonts w:ascii="Calibri" w:hAnsi="Calibri" w:cs="Calibri"/>
-          <w:b/>
-          <w:bCs/>
-        </w:rPr>
-        <w:t>UHasselt System Info</w:t>
+      <w:proofErr w:type="spellStart"/>
+      <w:r>
+        <w:rPr>
+          <w:rFonts w:ascii="Calibri" w:hAnsi="Calibri" w:cs="Calibri"/>
+          <w:b/>
+          <w:bCs/>
+        </w:rPr>
+        <w:t>UHasselt</w:t>
+      </w:r>
+      <w:proofErr w:type="spellEnd"/>
+      <w:r>
+        <w:rPr>
+          <w:rFonts w:ascii="Calibri" w:hAnsi="Calibri" w:cs="Calibri"/>
+          <w:b/>
+          <w:bCs/>
+        </w:rPr>
+        <w:t xml:space="preserve"> System Info</w:t>
       </w:r>
       <w:r>
         <w:rPr>
@@ -354,8 +638,18 @@
           <w:b/>
           <w:bCs/>
         </w:rPr>
-        <w:t>Software Center</w:t>
-      </w:r>
+        <w:t xml:space="preserve">Software </w:t>
+      </w:r>
+      <w:proofErr w:type="spellStart"/>
+      <w:r>
+        <w:rPr>
+          <w:rFonts w:ascii="Calibri" w:hAnsi="Calibri" w:cs="Calibri"/>
+          <w:b/>
+          <w:bCs/>
+        </w:rPr>
+        <w:t>Center</w:t>
+      </w:r>
+      <w:proofErr w:type="spellEnd"/>
       <w:r>
         <w:rPr>
           <w:rFonts w:ascii="Calibri" w:hAnsi="Calibri" w:cs="Calibri"/>
@@ -405,7 +699,23 @@
             <w:rStyle w:val="Hyperlink"/>
             <w:rFonts w:ascii="Calibri" w:hAnsi="Calibri" w:cs="Calibri"/>
           </w:rPr>
-          <w:t>Software Center: Applications Unavailable | Knowledge Article</w:t>
+          <w:t xml:space="preserve">Software </w:t>
+        </w:r>
+        <w:proofErr w:type="spellStart"/>
+        <w:r>
+          <w:rPr>
+            <w:rStyle w:val="Hyperlink"/>
+            <w:rFonts w:ascii="Calibri" w:hAnsi="Calibri" w:cs="Calibri"/>
+          </w:rPr>
+          <w:t>Center</w:t>
+        </w:r>
+        <w:proofErr w:type="spellEnd"/>
+        <w:r>
+          <w:rPr>
+            <w:rStyle w:val="Hyperlink"/>
+            <w:rFonts w:ascii="Calibri" w:hAnsi="Calibri" w:cs="Calibri"/>
+          </w:rPr>
+          <w:t>: Applications Unavailable | Knowledge Article</w:t>
         </w:r>
       </w:hyperlink>
     </w:p>
@@ -447,7 +757,21 @@
         <w:rPr>
           <w:rFonts w:ascii="Calibri" w:hAnsi="Calibri" w:cs="Calibri"/>
         </w:rPr>
-        <w:t>Does the problem persist after the steps above? Then report this via a ticket to the UHasselt Service Desk.</w:t>
+        <w:t xml:space="preserve">Does the problem persist after the steps above? Then report this via a ticket to the </w:t>
+      </w:r>
+      <w:proofErr w:type="spellStart"/>
+      <w:r>
+        <w:rPr>
+          <w:rFonts w:ascii="Calibri" w:hAnsi="Calibri" w:cs="Calibri"/>
+        </w:rPr>
+        <w:t>UHasselt</w:t>
+      </w:r>
+      <w:proofErr w:type="spellEnd"/>
+      <w:r>
+        <w:rPr>
+          <w:rFonts w:ascii="Calibri" w:hAnsi="Calibri" w:cs="Calibri"/>
+        </w:rPr>
+        <w:t xml:space="preserve"> Service Desk.</w:t>
       </w:r>
     </w:p>
     <w:p>
@@ -465,13 +789,23 @@
           <w:bCs/>
         </w:rPr>
       </w:pPr>
-      <w:r>
-        <w:rPr>
-          <w:rFonts w:ascii="Calibri" w:hAnsi="Calibri" w:cs="Calibri"/>
-          <w:b/>
-          <w:bCs/>
-        </w:rPr>
-        <w:t>UHasselt Service Desk</w:t>
+      <w:proofErr w:type="spellStart"/>
+      <w:r>
+        <w:rPr>
+          <w:rFonts w:ascii="Calibri" w:hAnsi="Calibri" w:cs="Calibri"/>
+          <w:b/>
+          <w:bCs/>
+        </w:rPr>
+        <w:t>UHasselt</w:t>
+      </w:r>
+      <w:proofErr w:type="spellEnd"/>
+      <w:r>
+        <w:rPr>
+          <w:rFonts w:ascii="Calibri" w:hAnsi="Calibri" w:cs="Calibri"/>
+          <w:b/>
+          <w:bCs/>
+        </w:rPr>
+        <w:t xml:space="preserve"> Service Desk</w:t>
       </w:r>
     </w:p>
     <w:p>

</xml_diff>